<commit_message>
generate KAK Honor Mitra
</commit_message>
<xml_diff>
--- a/public/honor-mitra.docx
+++ b/public/honor-mitra.docx
@@ -242,7 +242,6 @@
               <w:rPr>
                 <w:rFonts w:ascii="Arial" w:hAnsi="Arial" w:cs="Arial"/>
                 <w:noProof/>
-                <w:color w:val="FF0000"/>
                 <w:sz w:val="22"/>
                 <w:szCs w:val="22"/>
                 <w:lang w:val="id-ID"/>
@@ -252,7 +251,6 @@
               <w:rPr>
                 <w:rFonts w:ascii="Arial" w:hAnsi="Arial" w:cs="Arial"/>
                 <w:noProof/>
-                <w:color w:val="FF0000"/>
                 <w:sz w:val="22"/>
                 <w:szCs w:val="22"/>
               </w:rPr>
@@ -262,7 +260,6 @@
               <w:rPr>
                 <w:rFonts w:ascii="Arial" w:hAnsi="Arial" w:cs="Arial"/>
                 <w:noProof/>
-                <w:color w:val="FF0000"/>
                 <w:sz w:val="22"/>
                 <w:szCs w:val="22"/>
                 <w:lang w:val="id-ID"/>
@@ -273,7 +270,6 @@
               <w:rPr>
                 <w:rFonts w:ascii="Arial" w:hAnsi="Arial" w:cs="Arial"/>
                 <w:noProof/>
-                <w:color w:val="FF0000"/>
                 <w:sz w:val="22"/>
                 <w:szCs w:val="22"/>
                 <w:lang w:val="en-ID"/>
@@ -284,7 +280,6 @@
               <w:rPr>
                 <w:rFonts w:ascii="Arial" w:hAnsi="Arial" w:cs="Arial"/>
                 <w:noProof/>
-                <w:color w:val="FF0000"/>
                 <w:sz w:val="22"/>
                 <w:szCs w:val="22"/>
                 <w:lang w:val="en-ID"/>
@@ -295,7 +290,6 @@
               <w:rPr>
                 <w:rFonts w:ascii="Arial" w:hAnsi="Arial" w:cs="Arial"/>
                 <w:noProof/>
-                <w:color w:val="FF0000"/>
                 <w:sz w:val="22"/>
                 <w:szCs w:val="22"/>
                 <w:lang w:val="en-ID"/>
@@ -306,7 +300,6 @@
               <w:rPr>
                 <w:rFonts w:ascii="Arial" w:hAnsi="Arial" w:cs="Arial"/>
                 <w:noProof/>
-                <w:color w:val="FF0000"/>
                 <w:sz w:val="22"/>
                 <w:szCs w:val="22"/>
                 <w:lang w:val="en-ID"/>
@@ -317,7 +310,6 @@
               <w:rPr>
                 <w:rFonts w:ascii="Arial" w:hAnsi="Arial" w:cs="Arial"/>
                 <w:noProof/>
-                <w:color w:val="FF0000"/>
                 <w:sz w:val="22"/>
                 <w:szCs w:val="22"/>
                 <w:lang w:val="en-ID"/>
@@ -369,7 +361,6 @@
               <w:rPr>
                 <w:rFonts w:ascii="Arial" w:hAnsi="Arial" w:cs="Arial"/>
                 <w:noProof/>
-                <w:color w:val="FF0000"/>
                 <w:sz w:val="22"/>
                 <w:szCs w:val="22"/>
               </w:rPr>
@@ -379,7 +370,6 @@
               <w:rPr>
                 <w:rFonts w:ascii="Arial" w:hAnsi="Arial" w:cs="Arial"/>
                 <w:noProof/>
-                <w:color w:val="FF0000"/>
                 <w:sz w:val="22"/>
                 <w:szCs w:val="22"/>
                 <w:lang w:val="id-ID"/>
@@ -390,7 +380,6 @@
               <w:rPr>
                 <w:rFonts w:ascii="Arial" w:hAnsi="Arial" w:cs="Arial"/>
                 <w:noProof/>
-                <w:color w:val="FF0000"/>
                 <w:sz w:val="22"/>
                 <w:szCs w:val="22"/>
                 <w:lang w:val="en-ID"/>
@@ -401,7 +390,6 @@
               <w:rPr>
                 <w:rFonts w:ascii="Arial" w:hAnsi="Arial" w:cs="Arial"/>
                 <w:noProof/>
-                <w:color w:val="FF0000"/>
                 <w:sz w:val="22"/>
                 <w:szCs w:val="22"/>
                 <w:lang w:val="en-ID"/>
@@ -412,7 +400,6 @@
               <w:rPr>
                 <w:rFonts w:ascii="Arial" w:hAnsi="Arial" w:cs="Arial"/>
                 <w:noProof/>
-                <w:color w:val="FF0000"/>
                 <w:sz w:val="22"/>
                 <w:szCs w:val="22"/>
                 <w:lang w:val="en-ID"/>
@@ -423,7 +410,6 @@
               <w:rPr>
                 <w:rFonts w:ascii="Arial" w:hAnsi="Arial" w:cs="Arial"/>
                 <w:noProof/>
-                <w:color w:val="FF0000"/>
                 <w:sz w:val="22"/>
                 <w:szCs w:val="22"/>
                 <w:lang w:val="en-ID"/>
@@ -434,7 +420,6 @@
               <w:rPr>
                 <w:rFonts w:ascii="Arial" w:hAnsi="Arial" w:cs="Arial"/>
                 <w:noProof/>
-                <w:color w:val="FF0000"/>
                 <w:sz w:val="22"/>
                 <w:szCs w:val="22"/>
                 <w:lang w:val="en-ID"/>
@@ -445,7 +430,6 @@
               <w:rPr>
                 <w:rFonts w:ascii="Arial" w:hAnsi="Arial" w:cs="Arial"/>
                 <w:noProof/>
-                <w:color w:val="FF0000"/>
                 <w:sz w:val="22"/>
                 <w:szCs w:val="22"/>
               </w:rPr>
@@ -639,7 +623,6 @@
             <w:r>
               <w:rPr>
                 <w:rFonts w:ascii="Arial" w:hAnsi="Arial" w:cs="Arial"/>
-                <w:color w:val="FF0000"/>
                 <w:sz w:val="22"/>
                 <w:szCs w:val="22"/>
                 <w:shd w:val="clear" w:color="auto" w:fill="FFFFFF"/>
@@ -650,7 +633,6 @@
             <w:r>
               <w:rPr>
                 <w:rFonts w:ascii="Arial" w:hAnsi="Arial" w:cs="Arial"/>
-                <w:color w:val="FF0000"/>
                 <w:sz w:val="22"/>
                 <w:szCs w:val="22"/>
                 <w:shd w:val="clear" w:color="auto" w:fill="FFFFFF"/>
@@ -660,7 +642,6 @@
             <w:r>
               <w:rPr>
                 <w:rFonts w:ascii="Arial" w:hAnsi="Arial" w:cs="Arial"/>
-                <w:color w:val="FF0000"/>
                 <w:sz w:val="22"/>
                 <w:szCs w:val="22"/>
                 <w:shd w:val="clear" w:color="auto" w:fill="FFFFFF"/>
@@ -671,7 +652,6 @@
             <w:r>
               <w:rPr>
                 <w:rFonts w:ascii="Arial" w:hAnsi="Arial" w:cs="Arial"/>
-                <w:color w:val="FF0000"/>
                 <w:sz w:val="22"/>
                 <w:szCs w:val="22"/>
                 <w:shd w:val="clear" w:color="auto" w:fill="FFFFFF"/>
@@ -682,7 +662,6 @@
             <w:r>
               <w:rPr>
                 <w:rFonts w:ascii="Arial" w:hAnsi="Arial" w:cs="Arial"/>
-                <w:color w:val="FF0000"/>
                 <w:sz w:val="22"/>
                 <w:szCs w:val="22"/>
                 <w:shd w:val="clear" w:color="auto" w:fill="FFFFFF"/>
@@ -850,23 +829,12 @@
                 <w:sz w:val="22"/>
                 <w:szCs w:val="22"/>
               </w:rPr>
-              <w:t xml:space="preserve"> </w:t>
-            </w:r>
-            <w:r>
-              <w:rPr>
-                <w:rFonts w:ascii="Arial" w:hAnsi="Arial" w:cs="Arial"/>
-                <w:noProof/>
-                <w:color w:val="FF0000"/>
-                <w:sz w:val="22"/>
-                <w:szCs w:val="22"/>
-              </w:rPr>
-              <w:t xml:space="preserve">PJ </w:t>
-            </w:r>
-            <w:r>
-              <w:rPr>
-                <w:rFonts w:ascii="Arial" w:hAnsi="Arial" w:cs="Arial"/>
-                <w:noProof/>
-                <w:color w:val="FF0000"/>
+              <w:t xml:space="preserve"> PJ </w:t>
+            </w:r>
+            <w:r>
+              <w:rPr>
+                <w:rFonts w:ascii="Arial" w:hAnsi="Arial" w:cs="Arial"/>
+                <w:noProof/>
                 <w:sz w:val="22"/>
                 <w:szCs w:val="22"/>
               </w:rPr>
@@ -999,7 +967,6 @@
             <w:r>
               <w:rPr>
                 <w:rFonts w:ascii="Arial" w:hAnsi="Arial" w:cs="Arial"/>
-                <w:color w:val="FF0000"/>
                 <w:sz w:val="22"/>
                 <w:szCs w:val="22"/>
               </w:rPr>
@@ -1009,7 +976,6 @@
             <w:r>
               <w:rPr>
                 <w:rFonts w:ascii="Arial" w:hAnsi="Arial" w:cs="Arial"/>
-                <w:color w:val="FF0000"/>
                 <w:sz w:val="22"/>
                 <w:szCs w:val="22"/>
               </w:rPr>
@@ -1019,7 +985,6 @@
             <w:r>
               <w:rPr>
                 <w:rFonts w:ascii="Arial" w:hAnsi="Arial" w:cs="Arial"/>
-                <w:color w:val="FF0000"/>
                 <w:sz w:val="22"/>
                 <w:szCs w:val="22"/>
               </w:rPr>
@@ -1029,7 +994,6 @@
             <w:r>
               <w:rPr>
                 <w:rFonts w:ascii="Arial" w:hAnsi="Arial" w:cs="Arial"/>
-                <w:color w:val="FF0000"/>
                 <w:sz w:val="22"/>
                 <w:szCs w:val="22"/>
               </w:rPr>
@@ -1039,7 +1003,6 @@
             <w:r>
               <w:rPr>
                 <w:rFonts w:ascii="Arial" w:hAnsi="Arial" w:cs="Arial"/>
-                <w:color w:val="FF0000"/>
                 <w:sz w:val="22"/>
                 <w:szCs w:val="22"/>
               </w:rPr>
@@ -1049,7 +1012,6 @@
             <w:r>
               <w:rPr>
                 <w:rFonts w:ascii="Arial" w:hAnsi="Arial" w:cs="Arial"/>
-                <w:color w:val="FF0000"/>
                 <w:sz w:val="22"/>
                 <w:szCs w:val="22"/>
               </w:rPr>
@@ -1059,7 +1021,6 @@
             <w:r>
               <w:rPr>
                 <w:rFonts w:ascii="Arial" w:hAnsi="Arial" w:cs="Arial"/>
-                <w:color w:val="FF0000"/>
                 <w:sz w:val="22"/>
                 <w:szCs w:val="22"/>
               </w:rPr>
@@ -1069,7 +1030,6 @@
             <w:r>
               <w:rPr>
                 <w:rFonts w:ascii="Arial" w:hAnsi="Arial" w:cs="Arial"/>
-                <w:color w:val="FF0000"/>
                 <w:sz w:val="22"/>
                 <w:szCs w:val="22"/>
               </w:rPr>
@@ -1079,7 +1039,6 @@
             <w:r>
               <w:rPr>
                 <w:rFonts w:ascii="Arial" w:hAnsi="Arial" w:cs="Arial"/>
-                <w:color w:val="FF0000"/>
                 <w:sz w:val="22"/>
                 <w:szCs w:val="22"/>
               </w:rPr>
@@ -1089,7 +1048,6 @@
             <w:r>
               <w:rPr>
                 <w:rFonts w:ascii="Arial" w:hAnsi="Arial" w:cs="Arial"/>
-                <w:color w:val="FF0000"/>
                 <w:sz w:val="22"/>
                 <w:szCs w:val="22"/>
               </w:rPr>
@@ -1099,7 +1057,6 @@
             <w:r>
               <w:rPr>
                 <w:rFonts w:ascii="Arial" w:hAnsi="Arial" w:cs="Arial"/>
-                <w:color w:val="FF0000"/>
                 <w:sz w:val="22"/>
                 <w:szCs w:val="22"/>
               </w:rPr>
@@ -1109,7 +1066,6 @@
             <w:r>
               <w:rPr>
                 <w:rFonts w:ascii="Arial" w:hAnsi="Arial" w:cs="Arial"/>
-                <w:color w:val="FF0000"/>
                 <w:sz w:val="22"/>
                 <w:szCs w:val="22"/>
               </w:rPr>
@@ -1118,7 +1074,6 @@
             <w:r>
               <w:rPr>
                 <w:rFonts w:ascii="Arial" w:hAnsi="Arial" w:cs="Arial"/>
-                <w:color w:val="FF0000"/>
                 <w:sz w:val="22"/>
                 <w:szCs w:val="22"/>
               </w:rPr>
@@ -1128,7 +1083,6 @@
             <w:r>
               <w:rPr>
                 <w:rFonts w:ascii="Arial" w:hAnsi="Arial" w:cs="Arial"/>
-                <w:color w:val="FF0000"/>
                 <w:sz w:val="22"/>
                 <w:szCs w:val="22"/>
               </w:rPr>
@@ -1138,7 +1092,6 @@
             <w:r>
               <w:rPr>
                 <w:rFonts w:ascii="Arial" w:hAnsi="Arial" w:cs="Arial"/>
-                <w:color w:val="FF0000"/>
                 <w:sz w:val="22"/>
                 <w:szCs w:val="22"/>
               </w:rPr>
@@ -1147,7 +1100,6 @@
             <w:r>
               <w:rPr>
                 <w:rFonts w:ascii="Arial" w:hAnsi="Arial" w:cs="Arial"/>
-                <w:color w:val="FF0000"/>
                 <w:sz w:val="22"/>
                 <w:szCs w:val="22"/>
               </w:rPr>
@@ -1157,7 +1109,6 @@
             <w:r>
               <w:rPr>
                 <w:rFonts w:ascii="Arial" w:hAnsi="Arial" w:cs="Arial"/>
-                <w:color w:val="FF0000"/>
                 <w:sz w:val="22"/>
                 <w:szCs w:val="22"/>
               </w:rPr>
@@ -1167,7 +1118,6 @@
             <w:r>
               <w:rPr>
                 <w:rFonts w:ascii="Arial" w:hAnsi="Arial" w:cs="Arial"/>
-                <w:color w:val="FF0000"/>
                 <w:sz w:val="22"/>
                 <w:szCs w:val="22"/>
               </w:rPr>
@@ -1176,7 +1126,6 @@
             <w:r>
               <w:rPr>
                 <w:rFonts w:ascii="Arial" w:hAnsi="Arial" w:cs="Arial"/>
-                <w:color w:val="FF0000"/>
                 <w:sz w:val="22"/>
                 <w:szCs w:val="22"/>
               </w:rPr>
@@ -1186,7 +1135,6 @@
             <w:r>
               <w:rPr>
                 <w:rFonts w:ascii="Arial" w:hAnsi="Arial" w:cs="Arial"/>
-                <w:color w:val="FF0000"/>
                 <w:sz w:val="22"/>
                 <w:szCs w:val="22"/>
               </w:rPr>
@@ -1196,7 +1144,6 @@
             <w:r>
               <w:rPr>
                 <w:rFonts w:ascii="Arial" w:hAnsi="Arial" w:cs="Arial"/>
-                <w:color w:val="FF0000"/>
                 <w:sz w:val="22"/>
                 <w:szCs w:val="22"/>
               </w:rPr>
@@ -1205,7 +1152,6 @@
             <w:r>
               <w:rPr>
                 <w:rFonts w:ascii="Arial" w:hAnsi="Arial" w:cs="Arial"/>
-                <w:color w:val="FF0000"/>
                 <w:sz w:val="22"/>
                 <w:szCs w:val="22"/>
               </w:rPr>
@@ -1215,7 +1161,6 @@
             <w:r>
               <w:rPr>
                 <w:rFonts w:ascii="Arial" w:hAnsi="Arial" w:cs="Arial"/>
-                <w:color w:val="FF0000"/>
                 <w:sz w:val="22"/>
                 <w:szCs w:val="22"/>
               </w:rPr>
@@ -1225,7 +1170,6 @@
             <w:r>
               <w:rPr>
                 <w:rFonts w:ascii="Arial" w:hAnsi="Arial" w:cs="Arial"/>
-                <w:color w:val="FF0000"/>
                 <w:sz w:val="22"/>
                 <w:szCs w:val="22"/>
               </w:rPr>
@@ -1234,7 +1178,6 @@
             <w:r>
               <w:rPr>
                 <w:rFonts w:ascii="Arial" w:hAnsi="Arial" w:cs="Arial"/>
-                <w:color w:val="FF0000"/>
                 <w:sz w:val="22"/>
                 <w:szCs w:val="22"/>
               </w:rPr>
@@ -1244,7 +1187,6 @@
             <w:r>
               <w:rPr>
                 <w:rFonts w:ascii="Arial" w:hAnsi="Arial" w:cs="Arial"/>
-                <w:color w:val="FF0000"/>
                 <w:sz w:val="22"/>
                 <w:szCs w:val="22"/>
               </w:rPr>
@@ -1254,7 +1196,6 @@
             <w:r>
               <w:rPr>
                 <w:rFonts w:ascii="Arial" w:hAnsi="Arial" w:cs="Arial"/>
-                <w:color w:val="FF0000"/>
                 <w:sz w:val="22"/>
                 <w:szCs w:val="22"/>
               </w:rPr>
@@ -1263,7 +1204,6 @@
             <w:r>
               <w:rPr>
                 <w:rFonts w:ascii="Arial" w:hAnsi="Arial" w:cs="Arial"/>
-                <w:color w:val="FF0000"/>
                 <w:sz w:val="22"/>
                 <w:szCs w:val="22"/>
               </w:rPr>
@@ -1273,7 +1213,6 @@
             <w:r>
               <w:rPr>
                 <w:rFonts w:ascii="Arial" w:hAnsi="Arial" w:cs="Arial"/>
-                <w:color w:val="FF0000"/>
                 <w:sz w:val="22"/>
                 <w:szCs w:val="22"/>
               </w:rPr>
@@ -1283,7 +1222,6 @@
             <w:r>
               <w:rPr>
                 <w:rFonts w:ascii="Arial" w:hAnsi="Arial" w:cs="Arial"/>
-                <w:color w:val="FF0000"/>
                 <w:sz w:val="22"/>
                 <w:szCs w:val="22"/>
               </w:rPr>
@@ -1393,39 +1331,17 @@
                 <w:sz w:val="22"/>
                 <w:szCs w:val="22"/>
               </w:rPr>
-              <w:t xml:space="preserve">pembayaran </w:t>
-            </w:r>
-            <w:r>
-              <w:rPr>
-                <w:rFonts w:ascii="Arial" w:hAnsi="Arial" w:cs="Arial"/>
-                <w:noProof/>
-                <w:color w:val="FF0000"/>
-                <w:sz w:val="22"/>
-                <w:szCs w:val="22"/>
-              </w:rPr>
-              <w:t xml:space="preserve">honor petugas pemutakhiran dan pendataan lapangan </w:t>
-            </w:r>
-            <w:r>
-              <w:rPr>
-                <w:rFonts w:ascii="Arial" w:hAnsi="Arial" w:cs="Arial"/>
-                <w:noProof/>
-                <w:color w:val="FF0000"/>
+              <w:t xml:space="preserve">pembayaran honor petugas pemutakhiran dan pendataan lapangan </w:t>
+            </w:r>
+            <w:r>
+              <w:rPr>
+                <w:rFonts w:ascii="Arial" w:hAnsi="Arial" w:cs="Arial"/>
+                <w:noProof/>
                 <w:sz w:val="22"/>
                 <w:szCs w:val="22"/>
                 <w:lang w:val="en-ID"/>
               </w:rPr>
-              <w:t>${singkatan_resmi}</w:t>
-            </w:r>
-            <w:r>
-              <w:rPr>
-                <w:rFonts w:ascii="Arial" w:hAnsi="Arial" w:cs="Arial"/>
-                <w:noProof/>
-                <w:color w:val="FF0000"/>
-                <w:sz w:val="22"/>
-                <w:szCs w:val="22"/>
-                <w:lang w:val="en-ID"/>
-              </w:rPr>
-              <w:t xml:space="preserve"> </w:t>
+              <w:t xml:space="preserve">${singkatan_resmi} </w:t>
             </w:r>
             <w:r>
               <w:rPr>
@@ -1659,7 +1575,6 @@
                     <w:rPr>
                       <w:rFonts w:ascii="Arial" w:hAnsi="Arial" w:cs="Arial"/>
                       <w:bCs/>
-                      <w:color w:val="FF0000"/>
                       <w:sz w:val="22"/>
                       <w:szCs w:val="22"/>
                     </w:rPr>
@@ -1668,7 +1583,6 @@
                     <w:rPr>
                       <w:rFonts w:ascii="Arial" w:hAnsi="Arial" w:cs="Arial"/>
                       <w:bCs/>
-                      <w:color w:val="FF0000"/>
                       <w:sz w:val="22"/>
                       <w:szCs w:val="22"/>
                     </w:rPr>
@@ -1691,7 +1605,6 @@
                     <w:rPr>
                       <w:rFonts w:ascii="Arial" w:hAnsi="Arial" w:cs="Arial"/>
                       <w:bCs/>
-                      <w:color w:val="FF0000"/>
                       <w:sz w:val="22"/>
                       <w:szCs w:val="22"/>
                     </w:rPr>
@@ -1700,7 +1613,6 @@
                     <w:rPr>
                       <w:rFonts w:ascii="Arial" w:hAnsi="Arial" w:cs="Arial"/>
                       <w:bCs/>
-                      <w:color w:val="FF0000"/>
                       <w:sz w:val="22"/>
                       <w:szCs w:val="22"/>
                     </w:rPr>
@@ -1721,7 +1633,6 @@
                     <w:rPr>
                       <w:rFonts w:ascii="Arial" w:hAnsi="Arial" w:cs="Arial"/>
                       <w:bCs/>
-                      <w:color w:val="FF0000"/>
                       <w:sz w:val="22"/>
                       <w:szCs w:val="22"/>
                     </w:rPr>
@@ -1730,7 +1641,6 @@
                     <w:rPr>
                       <w:rFonts w:ascii="Arial" w:hAnsi="Arial" w:cs="Arial"/>
                       <w:bCs/>
-                      <w:color w:val="FF0000"/>
                       <w:sz w:val="22"/>
                       <w:szCs w:val="22"/>
                     </w:rPr>
@@ -1758,7 +1668,6 @@
                     <w:rPr>
                       <w:rFonts w:ascii="Arial" w:hAnsi="Arial" w:cs="Arial"/>
                       <w:bCs/>
-                      <w:color w:val="FF0000"/>
                       <w:sz w:val="22"/>
                       <w:szCs w:val="22"/>
                     </w:rPr>
@@ -1768,7 +1677,6 @@
                     <w:rPr>
                       <w:rFonts w:ascii="Arial" w:hAnsi="Arial" w:cs="Arial"/>
                       <w:bCs/>
-                      <w:color w:val="FF0000"/>
                       <w:sz w:val="22"/>
                       <w:szCs w:val="22"/>
                     </w:rPr>
@@ -1792,7 +1700,6 @@
                     <w:rPr>
                       <w:rFonts w:ascii="Arial" w:hAnsi="Arial" w:cs="Arial"/>
                       <w:bCs/>
-                      <w:color w:val="FF0000"/>
                       <w:sz w:val="22"/>
                       <w:szCs w:val="22"/>
                     </w:rPr>
@@ -1801,7 +1708,6 @@
                     <w:rPr>
                       <w:rFonts w:ascii="Arial" w:hAnsi="Arial" w:cs="Arial"/>
                       <w:bCs/>
-                      <w:color w:val="FF0000"/>
                       <w:sz w:val="22"/>
                       <w:szCs w:val="22"/>
                     </w:rPr>
@@ -1822,7 +1728,6 @@
                     <w:rPr>
                       <w:rFonts w:ascii="Arial" w:hAnsi="Arial" w:cs="Arial"/>
                       <w:bCs/>
-                      <w:color w:val="FF0000"/>
                       <w:sz w:val="22"/>
                       <w:szCs w:val="22"/>
                     </w:rPr>
@@ -1831,7 +1736,6 @@
                     <w:rPr>
                       <w:rFonts w:ascii="Arial" w:hAnsi="Arial" w:cs="Arial"/>
                       <w:bCs/>
-                      <w:color w:val="FF0000"/>
                       <w:sz w:val="22"/>
                       <w:szCs w:val="22"/>
                     </w:rPr>
@@ -1842,7 +1746,6 @@
                     <w:rPr>
                       <w:rFonts w:ascii="Arial" w:hAnsi="Arial" w:cs="Arial"/>
                       <w:bCs/>
-                      <w:color w:val="FF0000"/>
                       <w:sz w:val="22"/>
                       <w:szCs w:val="22"/>
                     </w:rPr>
@@ -1853,7 +1756,6 @@
                     <w:rPr>
                       <w:rFonts w:ascii="Arial" w:hAnsi="Arial" w:cs="Arial"/>
                       <w:bCs/>
-                      <w:color w:val="FF0000"/>
                       <w:sz w:val="22"/>
                       <w:szCs w:val="22"/>
                     </w:rPr>
@@ -1881,7 +1783,6 @@
                     <w:rPr>
                       <w:rFonts w:ascii="Arial" w:hAnsi="Arial" w:cs="Arial"/>
                       <w:bCs/>
-                      <w:color w:val="FF0000"/>
                       <w:sz w:val="22"/>
                       <w:szCs w:val="22"/>
                     </w:rPr>
@@ -1891,7 +1792,6 @@
                     <w:rPr>
                       <w:rFonts w:ascii="Arial" w:hAnsi="Arial" w:cs="Arial"/>
                       <w:bCs/>
-                      <w:color w:val="FF0000"/>
                       <w:sz w:val="22"/>
                       <w:szCs w:val="22"/>
                     </w:rPr>
@@ -1902,7 +1802,6 @@
                     <w:rPr>
                       <w:rFonts w:ascii="Arial" w:hAnsi="Arial" w:cs="Arial"/>
                       <w:bCs/>
-                      <w:color w:val="FF0000"/>
                       <w:sz w:val="22"/>
                       <w:szCs w:val="22"/>
                     </w:rPr>
@@ -1913,7 +1812,6 @@
                     <w:rPr>
                       <w:rFonts w:ascii="Arial" w:hAnsi="Arial" w:cs="Arial"/>
                       <w:bCs/>
-                      <w:color w:val="FF0000"/>
                       <w:sz w:val="22"/>
                       <w:szCs w:val="22"/>
                     </w:rPr>
@@ -1924,7 +1822,6 @@
                     <w:rPr>
                       <w:rFonts w:ascii="Arial" w:hAnsi="Arial" w:cs="Arial"/>
                       <w:bCs/>
-                      <w:color w:val="FF0000"/>
                       <w:sz w:val="22"/>
                       <w:szCs w:val="22"/>
                     </w:rPr>
@@ -1947,7 +1844,6 @@
                     <w:rPr>
                       <w:rFonts w:ascii="Arial" w:hAnsi="Arial" w:cs="Arial"/>
                       <w:bCs/>
-                      <w:color w:val="FF0000"/>
                       <w:sz w:val="22"/>
                       <w:szCs w:val="22"/>
                     </w:rPr>
@@ -1956,7 +1852,6 @@
                     <w:rPr>
                       <w:rFonts w:ascii="Arial" w:hAnsi="Arial" w:cs="Arial"/>
                       <w:bCs/>
-                      <w:color w:val="FF0000"/>
                       <w:sz w:val="22"/>
                       <w:szCs w:val="22"/>
                     </w:rPr>
@@ -1977,7 +1872,6 @@
                     <w:rPr>
                       <w:rFonts w:ascii="Arial" w:hAnsi="Arial" w:cs="Arial"/>
                       <w:bCs/>
-                      <w:color w:val="FF0000"/>
                       <w:sz w:val="22"/>
                       <w:szCs w:val="22"/>
                     </w:rPr>
@@ -1986,7 +1880,6 @@
                     <w:rPr>
                       <w:rFonts w:ascii="Arial" w:hAnsi="Arial" w:cs="Arial"/>
                       <w:bCs/>
-                      <w:color w:val="FF0000"/>
                       <w:sz w:val="22"/>
                       <w:szCs w:val="22"/>
                     </w:rPr>
@@ -1997,7 +1890,6 @@
                     <w:rPr>
                       <w:rFonts w:ascii="Arial" w:hAnsi="Arial" w:cs="Arial"/>
                       <w:bCs/>
-                      <w:color w:val="FF0000"/>
                       <w:sz w:val="22"/>
                       <w:szCs w:val="22"/>
                     </w:rPr>
@@ -2008,7 +1900,6 @@
                     <w:rPr>
                       <w:rFonts w:ascii="Arial" w:hAnsi="Arial" w:cs="Arial"/>
                       <w:bCs/>
-                      <w:color w:val="FF0000"/>
                       <w:sz w:val="22"/>
                       <w:szCs w:val="22"/>
                     </w:rPr>
@@ -2036,20 +1927,29 @@
                     <w:rPr>
                       <w:rFonts w:ascii="Arial" w:hAnsi="Arial" w:cs="Arial"/>
                       <w:bCs/>
-                      <w:color w:val="FF0000"/>
                       <w:sz w:val="22"/>
                       <w:szCs w:val="22"/>
                     </w:rPr>
                   </w:pPr>
+                  <w:proofErr w:type="spellStart"/>
                   <w:r>
                     <w:rPr>
                       <w:rFonts w:ascii="Arial" w:hAnsi="Arial" w:cs="Arial"/>
                       <w:bCs/>
-                      <w:color w:val="FF0000"/>
                       <w:sz w:val="22"/>
                       <w:szCs w:val="22"/>
                     </w:rPr>
-                    <w:t>Rincian Output</w:t>
+                    <w:t>Rincian</w:t>
+                  </w:r>
+                  <w:proofErr w:type="spellEnd"/>
+                  <w:r>
+                    <w:rPr>
+                      <w:rFonts w:ascii="Arial" w:hAnsi="Arial" w:cs="Arial"/>
+                      <w:bCs/>
+                      <w:sz w:val="22"/>
+                      <w:szCs w:val="22"/>
+                    </w:rPr>
+                    <w:t xml:space="preserve"> Output</w:t>
                   </w:r>
                 </w:p>
               </w:tc>
@@ -2068,7 +1968,6 @@
                     <w:rPr>
                       <w:rFonts w:ascii="Arial" w:hAnsi="Arial" w:cs="Arial"/>
                       <w:bCs/>
-                      <w:color w:val="FF0000"/>
                       <w:sz w:val="22"/>
                       <w:szCs w:val="22"/>
                     </w:rPr>
@@ -2077,7 +1976,6 @@
                     <w:rPr>
                       <w:rFonts w:ascii="Arial" w:hAnsi="Arial" w:cs="Arial"/>
                       <w:bCs/>
-                      <w:color w:val="FF0000"/>
                       <w:sz w:val="22"/>
                       <w:szCs w:val="22"/>
                     </w:rPr>
@@ -2098,7 +1996,6 @@
                     <w:rPr>
                       <w:rFonts w:ascii="Arial" w:hAnsi="Arial" w:cs="Arial"/>
                       <w:bCs/>
-                      <w:color w:val="FF0000"/>
                       <w:sz w:val="22"/>
                       <w:szCs w:val="22"/>
                     </w:rPr>
@@ -2107,7 +2004,6 @@
                     <w:rPr>
                       <w:rFonts w:ascii="Arial" w:hAnsi="Arial" w:cs="Arial"/>
                       <w:bCs/>
-                      <w:color w:val="FF0000"/>
                       <w:sz w:val="22"/>
                       <w:szCs w:val="22"/>
                     </w:rPr>
@@ -2118,7 +2014,6 @@
                     <w:rPr>
                       <w:rFonts w:ascii="Arial" w:hAnsi="Arial" w:cs="Arial"/>
                       <w:bCs/>
-                      <w:color w:val="FF0000"/>
                       <w:sz w:val="22"/>
                       <w:szCs w:val="22"/>
                     </w:rPr>
@@ -2129,7 +2024,6 @@
                     <w:rPr>
                       <w:rFonts w:ascii="Arial" w:hAnsi="Arial" w:cs="Arial"/>
                       <w:bCs/>
-                      <w:color w:val="FF0000"/>
                       <w:sz w:val="22"/>
                       <w:szCs w:val="22"/>
                     </w:rPr>
@@ -2157,21 +2051,21 @@
                     <w:rPr>
                       <w:rFonts w:ascii="Arial" w:hAnsi="Arial" w:cs="Arial"/>
                       <w:bCs/>
-                      <w:color w:val="FF0000"/>
                       <w:sz w:val="22"/>
                       <w:szCs w:val="22"/>
                     </w:rPr>
                   </w:pPr>
+                  <w:proofErr w:type="spellStart"/>
                   <w:r>
                     <w:rPr>
                       <w:rFonts w:ascii="Arial" w:hAnsi="Arial" w:cs="Arial"/>
                       <w:bCs/>
-                      <w:color w:val="FF0000"/>
                       <w:sz w:val="22"/>
                       <w:szCs w:val="22"/>
                     </w:rPr>
                     <w:t>Komponen</w:t>
                   </w:r>
+                  <w:proofErr w:type="spellEnd"/>
                 </w:p>
               </w:tc>
               <w:tc>
@@ -2189,7 +2083,6 @@
                     <w:rPr>
                       <w:rFonts w:ascii="Arial" w:hAnsi="Arial" w:cs="Arial"/>
                       <w:bCs/>
-                      <w:color w:val="FF0000"/>
                       <w:sz w:val="22"/>
                       <w:szCs w:val="22"/>
                     </w:rPr>
@@ -2198,7 +2091,6 @@
                     <w:rPr>
                       <w:rFonts w:ascii="Arial" w:hAnsi="Arial" w:cs="Arial"/>
                       <w:bCs/>
-                      <w:color w:val="FF0000"/>
                       <w:sz w:val="22"/>
                       <w:szCs w:val="22"/>
                     </w:rPr>
@@ -2219,7 +2111,6 @@
                     <w:rPr>
                       <w:rFonts w:ascii="Arial" w:hAnsi="Arial" w:cs="Arial"/>
                       <w:bCs/>
-                      <w:color w:val="FF0000"/>
                       <w:sz w:val="22"/>
                       <w:szCs w:val="22"/>
                     </w:rPr>
@@ -2228,7 +2119,6 @@
                     <w:rPr>
                       <w:rFonts w:ascii="Arial" w:hAnsi="Arial" w:cs="Arial"/>
                       <w:bCs/>
-                      <w:color w:val="FF0000"/>
                       <w:sz w:val="22"/>
                       <w:szCs w:val="22"/>
                     </w:rPr>
@@ -2239,7 +2129,6 @@
                     <w:rPr>
                       <w:rFonts w:ascii="Arial" w:hAnsi="Arial" w:cs="Arial"/>
                       <w:bCs/>
-                      <w:color w:val="FF0000"/>
                       <w:sz w:val="22"/>
                       <w:szCs w:val="22"/>
                     </w:rPr>
@@ -2250,7 +2139,6 @@
                     <w:rPr>
                       <w:rFonts w:ascii="Arial" w:hAnsi="Arial" w:cs="Arial"/>
                       <w:bCs/>
-                      <w:color w:val="FF0000"/>
                       <w:sz w:val="22"/>
                       <w:szCs w:val="22"/>
                     </w:rPr>
@@ -2278,7 +2166,6 @@
                     <w:rPr>
                       <w:rFonts w:ascii="Arial" w:hAnsi="Arial" w:cs="Arial"/>
                       <w:bCs/>
-                      <w:color w:val="FF0000"/>
                       <w:sz w:val="22"/>
                       <w:szCs w:val="22"/>
                     </w:rPr>
@@ -2287,12 +2174,22 @@
                     <w:rPr>
                       <w:rFonts w:ascii="Arial" w:hAnsi="Arial" w:cs="Arial"/>
                       <w:bCs/>
-                      <w:color w:val="FF0000"/>
                       <w:sz w:val="22"/>
                       <w:szCs w:val="22"/>
                     </w:rPr>
-                    <w:t>Sub Komponen</w:t>
+                    <w:t xml:space="preserve">Sub </w:t>
                   </w:r>
+                  <w:proofErr w:type="spellStart"/>
+                  <w:r>
+                    <w:rPr>
+                      <w:rFonts w:ascii="Arial" w:hAnsi="Arial" w:cs="Arial"/>
+                      <w:bCs/>
+                      <w:sz w:val="22"/>
+                      <w:szCs w:val="22"/>
+                    </w:rPr>
+                    <w:t>Komponen</w:t>
+                  </w:r>
+                  <w:proofErr w:type="spellEnd"/>
                 </w:p>
               </w:tc>
               <w:tc>
@@ -2310,7 +2207,6 @@
                     <w:rPr>
                       <w:rFonts w:ascii="Arial" w:hAnsi="Arial" w:cs="Arial"/>
                       <w:bCs/>
-                      <w:color w:val="FF0000"/>
                       <w:sz w:val="22"/>
                       <w:szCs w:val="22"/>
                     </w:rPr>
@@ -2319,7 +2215,6 @@
                     <w:rPr>
                       <w:rFonts w:ascii="Arial" w:hAnsi="Arial" w:cs="Arial"/>
                       <w:bCs/>
-                      <w:color w:val="FF0000"/>
                       <w:sz w:val="22"/>
                       <w:szCs w:val="22"/>
                     </w:rPr>
@@ -2340,7 +2235,6 @@
                     <w:rPr>
                       <w:rFonts w:ascii="Arial" w:hAnsi="Arial" w:cs="Arial"/>
                       <w:bCs/>
-                      <w:color w:val="FF0000"/>
                       <w:sz w:val="22"/>
                       <w:szCs w:val="22"/>
                     </w:rPr>
@@ -2349,7 +2243,6 @@
                     <w:rPr>
                       <w:rFonts w:ascii="Arial" w:hAnsi="Arial" w:cs="Arial"/>
                       <w:bCs/>
-                      <w:color w:val="FF0000"/>
                       <w:sz w:val="22"/>
                       <w:szCs w:val="22"/>
                     </w:rPr>
@@ -2360,7 +2253,6 @@
                     <w:rPr>
                       <w:rFonts w:ascii="Arial" w:hAnsi="Arial" w:cs="Arial"/>
                       <w:bCs/>
-                      <w:color w:val="FF0000"/>
                       <w:sz w:val="22"/>
                       <w:szCs w:val="22"/>
                     </w:rPr>
@@ -2371,7 +2263,6 @@
                     <w:rPr>
                       <w:rFonts w:ascii="Arial" w:hAnsi="Arial" w:cs="Arial"/>
                       <w:bCs/>
-                      <w:color w:val="FF0000"/>
                       <w:sz w:val="22"/>
                       <w:szCs w:val="22"/>
                     </w:rPr>
@@ -2392,16 +2283,16 @@
               <w:tblLook w:val="0400" w:firstRow="0" w:lastRow="0" w:firstColumn="0" w:lastColumn="0" w:noHBand="0" w:noVBand="1"/>
             </w:tblPr>
             <w:tblGrid>
-              <w:gridCol w:w="79"/>
-              <w:gridCol w:w="832"/>
-              <w:gridCol w:w="1253"/>
-              <w:gridCol w:w="398"/>
-              <w:gridCol w:w="209"/>
-              <w:gridCol w:w="518"/>
-              <w:gridCol w:w="1069"/>
-              <w:gridCol w:w="977"/>
-              <w:gridCol w:w="859"/>
-              <w:gridCol w:w="62"/>
+              <w:gridCol w:w="216"/>
+              <w:gridCol w:w="723"/>
+              <w:gridCol w:w="1313"/>
+              <w:gridCol w:w="408"/>
+              <w:gridCol w:w="216"/>
+              <w:gridCol w:w="528"/>
+              <w:gridCol w:w="1118"/>
+              <w:gridCol w:w="1021"/>
+              <w:gridCol w:w="896"/>
+              <w:gridCol w:w="65"/>
             </w:tblGrid>
             <w:tr>
               <w:trPr>
@@ -2743,7 +2634,6 @@
                     <w:ind w:left="-20" w:right="-20"/>
                     <w:rPr>
                       <w:rFonts w:ascii="Arial" w:eastAsia="Arial" w:hAnsi="Arial" w:cs="Arial"/>
-                      <w:color w:val="FF0000"/>
                       <w:sz w:val="22"/>
                       <w:szCs w:val="22"/>
                       <w:lang w:val="id-ID"/>
@@ -2752,7 +2642,6 @@
                   <w:r>
                     <w:rPr>
                       <w:rFonts w:ascii="Arial" w:eastAsia="Arial" w:hAnsi="Arial" w:cs="Arial"/>
-                      <w:color w:val="FF0000"/>
                       <w:sz w:val="22"/>
                       <w:szCs w:val="22"/>
                     </w:rPr>
@@ -2762,7 +2651,6 @@
                   <w:r>
                     <w:rPr>
                       <w:rFonts w:ascii="Arial" w:eastAsia="Arial" w:hAnsi="Arial" w:cs="Arial"/>
-                      <w:color w:val="FF0000"/>
                       <w:sz w:val="22"/>
                       <w:szCs w:val="22"/>
                     </w:rPr>
@@ -2772,7 +2660,6 @@
                   <w:r>
                     <w:rPr>
                       <w:rFonts w:ascii="Arial" w:eastAsia="Arial" w:hAnsi="Arial" w:cs="Arial"/>
-                      <w:color w:val="FF0000"/>
                       <w:sz w:val="22"/>
                       <w:szCs w:val="22"/>
                     </w:rPr>
@@ -2799,7 +2686,6 @@
                     <w:ind w:right="-20"/>
                     <w:rPr>
                       <w:rFonts w:ascii="Arial" w:eastAsia="Arial" w:hAnsi="Arial" w:cs="Arial"/>
-                      <w:color w:val="FF0000"/>
                       <w:sz w:val="22"/>
                       <w:szCs w:val="22"/>
                       <w:lang w:val="en-ID"/>
@@ -2808,7 +2694,6 @@
                   <w:r>
                     <w:rPr>
                       <w:rFonts w:ascii="Arial" w:eastAsia="Arial" w:hAnsi="Arial" w:cs="Arial"/>
-                      <w:color w:val="FF0000"/>
                       <w:sz w:val="22"/>
                       <w:szCs w:val="22"/>
                       <w:lang w:val="en-ID"/>
@@ -2819,7 +2704,6 @@
                   <w:r>
                     <w:rPr>
                       <w:rFonts w:ascii="Arial" w:eastAsia="Arial" w:hAnsi="Arial" w:cs="Arial"/>
-                      <w:color w:val="FF0000"/>
                       <w:sz w:val="22"/>
                       <w:szCs w:val="22"/>
                       <w:lang w:val="en-ID"/>
@@ -2830,7 +2714,6 @@
                   <w:r>
                     <w:rPr>
                       <w:rFonts w:ascii="Arial" w:eastAsia="Arial" w:hAnsi="Arial" w:cs="Arial"/>
-                      <w:color w:val="FF0000"/>
                       <w:sz w:val="22"/>
                       <w:szCs w:val="22"/>
                       <w:lang w:val="en-ID"/>
@@ -2858,7 +2741,6 @@
                     <w:ind w:left="-20" w:right="-20"/>
                     <w:rPr>
                       <w:rFonts w:ascii="Arial" w:eastAsia="Arial" w:hAnsi="Arial" w:cs="Arial"/>
-                      <w:color w:val="FF0000"/>
                       <w:sz w:val="22"/>
                       <w:szCs w:val="22"/>
                       <w:lang w:val="en-ID"/>
@@ -2867,7 +2749,6 @@
                   <w:r>
                     <w:rPr>
                       <w:rFonts w:ascii="Arial" w:eastAsia="Arial" w:hAnsi="Arial" w:cs="Arial"/>
-                      <w:color w:val="FF0000"/>
                       <w:sz w:val="22"/>
                       <w:szCs w:val="22"/>
                       <w:lang w:val="en-ID"/>
@@ -2894,7 +2775,6 @@
                     <w:ind w:left="-20" w:right="-20"/>
                     <w:rPr>
                       <w:rFonts w:ascii="Arial" w:eastAsia="Arial" w:hAnsi="Arial" w:cs="Arial"/>
-                      <w:color w:val="FF0000"/>
                       <w:sz w:val="22"/>
                       <w:szCs w:val="22"/>
                       <w:lang w:val="en-ID"/>
@@ -2903,7 +2783,6 @@
                   <w:r>
                     <w:rPr>
                       <w:rFonts w:ascii="Arial" w:eastAsia="Arial" w:hAnsi="Arial" w:cs="Arial"/>
-                      <w:color w:val="FF0000"/>
                       <w:sz w:val="22"/>
                       <w:szCs w:val="22"/>
                       <w:lang w:val="en-ID"/>
@@ -2914,7 +2793,6 @@
                   <w:r>
                     <w:rPr>
                       <w:rFonts w:ascii="Arial" w:eastAsia="Arial" w:hAnsi="Arial" w:cs="Arial"/>
-                      <w:color w:val="FF0000"/>
                       <w:sz w:val="22"/>
                       <w:szCs w:val="22"/>
                       <w:lang w:val="en-ID"/>
@@ -2925,7 +2803,6 @@
                   <w:r>
                     <w:rPr>
                       <w:rFonts w:ascii="Arial" w:eastAsia="Arial" w:hAnsi="Arial" w:cs="Arial"/>
-                      <w:color w:val="FF0000"/>
                       <w:sz w:val="22"/>
                       <w:szCs w:val="22"/>
                       <w:lang w:val="en-ID"/>
@@ -2953,7 +2830,6 @@
                     <w:jc w:val="right"/>
                     <w:rPr>
                       <w:rFonts w:ascii="Arial" w:eastAsia="Arial" w:hAnsi="Arial" w:cs="Arial"/>
-                      <w:color w:val="FF0000"/>
                       <w:sz w:val="22"/>
                       <w:szCs w:val="22"/>
                       <w:lang w:val="en-ID"/>
@@ -2962,7 +2838,6 @@
                   <w:r>
                     <w:rPr>
                       <w:rFonts w:ascii="Arial" w:eastAsia="Arial" w:hAnsi="Arial" w:cs="Arial"/>
-                      <w:color w:val="FF0000"/>
                       <w:sz w:val="22"/>
                       <w:szCs w:val="22"/>
                       <w:lang w:val="en-ID"/>
@@ -2973,7 +2848,6 @@
                   <w:r>
                     <w:rPr>
                       <w:rFonts w:ascii="Arial" w:eastAsia="Arial" w:hAnsi="Arial" w:cs="Arial"/>
-                      <w:color w:val="FF0000"/>
                       <w:sz w:val="22"/>
                       <w:szCs w:val="22"/>
                       <w:lang w:val="en-ID"/>
@@ -2984,7 +2858,6 @@
                   <w:r>
                     <w:rPr>
                       <w:rFonts w:ascii="Arial" w:eastAsia="Arial" w:hAnsi="Arial" w:cs="Arial"/>
-                      <w:color w:val="FF0000"/>
                       <w:sz w:val="22"/>
                       <w:szCs w:val="22"/>
                       <w:lang w:val="en-ID"/>
@@ -3013,7 +2886,6 @@
                     <w:jc w:val="right"/>
                     <w:rPr>
                       <w:rFonts w:ascii="Arial" w:eastAsia="Arial" w:hAnsi="Arial" w:cs="Arial"/>
-                      <w:color w:val="FF0000"/>
                       <w:sz w:val="22"/>
                       <w:szCs w:val="22"/>
                       <w:lang w:val="en-ID"/>
@@ -3022,7 +2894,6 @@
                   <w:r>
                     <w:rPr>
                       <w:rFonts w:ascii="Arial" w:eastAsia="Arial" w:hAnsi="Arial" w:cs="Arial"/>
-                      <w:color w:val="FF0000"/>
                       <w:sz w:val="22"/>
                       <w:szCs w:val="22"/>
                       <w:lang w:val="en-ID"/>
@@ -3033,7 +2904,6 @@
                   <w:r>
                     <w:rPr>
                       <w:rFonts w:ascii="Arial" w:eastAsia="Arial" w:hAnsi="Arial" w:cs="Arial"/>
-                      <w:color w:val="FF0000"/>
                       <w:sz w:val="22"/>
                       <w:szCs w:val="22"/>
                       <w:lang w:val="en-ID"/>
@@ -3044,7 +2914,6 @@
                   <w:r>
                     <w:rPr>
                       <w:rFonts w:ascii="Arial" w:eastAsia="Arial" w:hAnsi="Arial" w:cs="Arial"/>
-                      <w:color w:val="FF0000"/>
                       <w:sz w:val="22"/>
                       <w:szCs w:val="22"/>
                       <w:lang w:val="en-ID"/>
@@ -3081,7 +2950,6 @@
                 <w:rFonts w:ascii="Arial" w:hAnsi="Arial" w:cs="Arial"/>
                 <w:bCs/>
                 <w:noProof/>
-                <w:color w:val="FF0000"/>
                 <w:sz w:val="22"/>
                 <w:szCs w:val="22"/>
               </w:rPr>
@@ -3107,7 +2975,6 @@
             <w:r>
               <w:rPr>
                 <w:rFonts w:ascii="Arial" w:eastAsia="Arial" w:hAnsi="Arial" w:cs="Arial"/>
-                <w:color w:val="FF0000"/>
                 <w:sz w:val="22"/>
                 <w:szCs w:val="22"/>
                 <w:lang w:val="en-ID"/>
@@ -3118,7 +2985,6 @@
             <w:r>
               <w:rPr>
                 <w:rFonts w:ascii="Arial" w:eastAsia="Arial" w:hAnsi="Arial" w:cs="Arial"/>
-                <w:color w:val="FF0000"/>
                 <w:sz w:val="22"/>
                 <w:szCs w:val="22"/>
                 <w:lang w:val="en-ID"/>
@@ -3129,7 +2995,6 @@
             <w:r>
               <w:rPr>
                 <w:rFonts w:ascii="Arial" w:eastAsia="Arial" w:hAnsi="Arial" w:cs="Arial"/>
-                <w:color w:val="FF0000"/>
                 <w:sz w:val="22"/>
                 <w:szCs w:val="22"/>
                 <w:lang w:val="en-ID"/>
@@ -3140,7 +3005,6 @@
             <w:r>
               <w:rPr>
                 <w:rFonts w:ascii="Arial" w:eastAsia="Arial" w:hAnsi="Arial" w:cs="Arial"/>
-                <w:color w:val="FF0000"/>
                 <w:sz w:val="22"/>
                 <w:szCs w:val="22"/>
                 <w:lang w:val="en-ID"/>
@@ -3151,7 +3015,6 @@
             <w:r>
               <w:rPr>
                 <w:rFonts w:ascii="Arial" w:eastAsia="Arial" w:hAnsi="Arial" w:cs="Arial"/>
-                <w:color w:val="FF0000"/>
                 <w:sz w:val="22"/>
                 <w:szCs w:val="22"/>
                 <w:lang w:val="en-ID"/>
@@ -3162,7 +3025,6 @@
             <w:r>
               <w:rPr>
                 <w:rFonts w:ascii="Arial" w:eastAsia="Arial" w:hAnsi="Arial" w:cs="Arial"/>
-                <w:color w:val="FF0000"/>
                 <w:sz w:val="22"/>
                 <w:szCs w:val="22"/>
                 <w:lang w:val="en-ID"/>
@@ -3173,7 +3035,6 @@
             <w:r>
               <w:rPr>
                 <w:rFonts w:ascii="Arial" w:eastAsia="Arial" w:hAnsi="Arial" w:cs="Arial"/>
-                <w:color w:val="FF0000"/>
                 <w:sz w:val="22"/>
                 <w:szCs w:val="22"/>
                 <w:lang w:val="en-ID"/>
@@ -3183,7 +3044,6 @@
             <w:r>
               <w:rPr>
                 <w:rFonts w:ascii="Arial" w:eastAsia="Arial" w:hAnsi="Arial" w:cs="Arial"/>
-                <w:color w:val="FF0000"/>
                 <w:sz w:val="22"/>
                 <w:szCs w:val="22"/>
                 <w:lang w:val="en-ID"/>
@@ -3194,44 +3054,29 @@
             <w:r>
               <w:rPr>
                 <w:rFonts w:ascii="Arial" w:eastAsia="Arial" w:hAnsi="Arial" w:cs="Arial"/>
-                <w:color w:val="FF0000"/>
                 <w:sz w:val="22"/>
                 <w:szCs w:val="22"/>
                 <w:lang w:val="en-ID"/>
               </w:rPr>
-              <w:t>singkatan_</w:t>
-            </w:r>
-            <w:proofErr w:type="gramStart"/>
+              <w:t>singkatan_resmi</w:t>
+            </w:r>
+            <w:proofErr w:type="spellEnd"/>
             <w:r>
               <w:rPr>
                 <w:rFonts w:ascii="Arial" w:eastAsia="Arial" w:hAnsi="Arial" w:cs="Arial"/>
-                <w:color w:val="FF0000"/>
                 <w:sz w:val="22"/>
                 <w:szCs w:val="22"/>
                 <w:lang w:val="en-ID"/>
               </w:rPr>
-              <w:t>resmi</w:t>
-            </w:r>
-            <w:proofErr w:type="spellEnd"/>
+              <w:t>}</w:t>
+            </w:r>
             <w:r>
               <w:rPr>
                 <w:rFonts w:ascii="Arial" w:eastAsia="Arial" w:hAnsi="Arial" w:cs="Arial"/>
-                <w:color w:val="FF0000"/>
                 <w:sz w:val="22"/>
                 <w:szCs w:val="22"/>
                 <w:lang w:val="en-ID"/>
               </w:rPr>
-              <w:t>}|</w:t>
-            </w:r>
-            <w:proofErr w:type="gramEnd"/>
-            <w:r>
-              <w:rPr>
-                <w:rFonts w:ascii="Arial" w:eastAsia="Arial" w:hAnsi="Arial" w:cs="Arial"/>
-                <w:color w:val="FF0000"/>
-                <w:sz w:val="22"/>
-                <w:szCs w:val="22"/>
-                <w:lang w:val="en-ID"/>
-              </w:rPr>
               <w:t xml:space="preserve"> </w:t>
             </w:r>
             <w:r>
@@ -3248,16 +3093,12 @@
                 <w:rFonts w:ascii="Arial" w:hAnsi="Arial" w:cs="Arial"/>
                 <w:b/>
                 <w:noProof/>
-                <w:color w:val="FF0000"/>
                 <w:sz w:val="22"/>
                 <w:szCs w:val="22"/>
               </w:rPr>
               <w:t>Rp.</w:t>
             </w:r>
             <w:r>
-              <w:rPr>
-                <w:color w:val="FF0000"/>
-              </w:rPr>
               <w:t xml:space="preserve"> </w:t>
             </w:r>
             <w:r>
@@ -3265,18 +3106,36 @@
                 <w:rFonts w:ascii="Arial" w:hAnsi="Arial" w:cs="Arial"/>
                 <w:b/>
                 <w:noProof/>
-                <w:color w:val="FF0000"/>
-                <w:sz w:val="22"/>
-                <w:szCs w:val="22"/>
-              </w:rPr>
-              <w:t>${total_honor}</w:t>
+                <w:sz w:val="22"/>
+                <w:szCs w:val="22"/>
+              </w:rPr>
+              <w:t>${total_</w:t>
             </w:r>
             <w:r>
               <w:rPr>
                 <w:rFonts w:ascii="Arial" w:hAnsi="Arial" w:cs="Arial"/>
                 <w:b/>
                 <w:noProof/>
-                <w:color w:val="FF0000"/>
+                <w:sz w:val="22"/>
+                <w:szCs w:val="22"/>
+              </w:rPr>
+              <w:t>biaya</w:t>
+            </w:r>
+            <w:r>
+              <w:rPr>
+                <w:rFonts w:ascii="Arial" w:hAnsi="Arial" w:cs="Arial"/>
+                <w:b/>
+                <w:noProof/>
+                <w:sz w:val="22"/>
+                <w:szCs w:val="22"/>
+              </w:rPr>
+              <w:t>}</w:t>
+            </w:r>
+            <w:r>
+              <w:rPr>
+                <w:rFonts w:ascii="Arial" w:hAnsi="Arial" w:cs="Arial"/>
+                <w:b/>
+                <w:noProof/>
                 <w:sz w:val="22"/>
                 <w:szCs w:val="22"/>
               </w:rPr>
@@ -3286,7 +3145,6 @@
               <w:rPr>
                 <w:rFonts w:ascii="Arial" w:hAnsi="Arial" w:cs="Arial"/>
                 <w:noProof/>
-                <w:color w:val="FF0000"/>
                 <w:sz w:val="22"/>
                 <w:szCs w:val="22"/>
               </w:rPr>
@@ -3296,27 +3154,33 @@
               <w:rPr>
                 <w:rFonts w:ascii="Arial" w:hAnsi="Arial" w:cs="Arial"/>
                 <w:noProof/>
-                <w:color w:val="FF0000"/>
-                <w:sz w:val="22"/>
-                <w:szCs w:val="22"/>
-              </w:rPr>
-              <w:t>$t</w:t>
-            </w:r>
-            <w:r>
-              <w:rPr>
-                <w:rFonts w:ascii="Arial" w:hAnsi="Arial" w:cs="Arial"/>
-                <w:noProof/>
-                <w:color w:val="FF0000"/>
-                <w:sz w:val="22"/>
-                <w:szCs w:val="22"/>
-              </w:rPr>
-              <w:t>otal_honor_terbilang</w:t>
-            </w:r>
-            <w:r>
-              <w:rPr>
-                <w:rFonts w:ascii="Arial" w:hAnsi="Arial" w:cs="Arial"/>
-                <w:noProof/>
-                <w:color w:val="FF0000"/>
+                <w:sz w:val="22"/>
+                <w:szCs w:val="22"/>
+              </w:rPr>
+              <w:t>$</w:t>
+            </w:r>
+            <w:r>
+              <w:rPr>
+                <w:rFonts w:ascii="Arial" w:hAnsi="Arial" w:cs="Arial"/>
+                <w:noProof/>
+                <w:sz w:val="22"/>
+                <w:szCs w:val="22"/>
+              </w:rPr>
+              <w:t>{total_biaya_terbilang</w:t>
+            </w:r>
+            <w:r>
+              <w:rPr>
+                <w:rFonts w:ascii="Arial" w:hAnsi="Arial" w:cs="Arial"/>
+                <w:noProof/>
+                <w:sz w:val="22"/>
+                <w:szCs w:val="22"/>
+              </w:rPr>
+              <w:t>}</w:t>
+            </w:r>
+            <w:r>
+              <w:rPr>
+                <w:rFonts w:ascii="Arial" w:hAnsi="Arial" w:cs="Arial"/>
+                <w:noProof/>
                 <w:sz w:val="22"/>
                 <w:szCs w:val="22"/>
               </w:rPr>
@@ -4037,17 +3901,15 @@
                 <w:rFonts w:ascii="Arial" w:hAnsi="Arial" w:cs="Arial"/>
                 <w:bCs/>
                 <w:noProof/>
-                <w:color w:val="FF0000"/>
-                <w:sz w:val="22"/>
-                <w:szCs w:val="22"/>
-              </w:rPr>
-            </w:pPr>
-            <w:r>
-              <w:rPr>
-                <w:rFonts w:ascii="Arial" w:hAnsi="Arial" w:cs="Arial"/>
-                <w:bCs/>
-                <w:noProof/>
-                <w:color w:val="FF0000"/>
+                <w:sz w:val="22"/>
+                <w:szCs w:val="22"/>
+              </w:rPr>
+            </w:pPr>
+            <w:r>
+              <w:rPr>
+                <w:rFonts w:ascii="Arial" w:hAnsi="Arial" w:cs="Arial"/>
+                <w:bCs/>
+                <w:noProof/>
                 <w:sz w:val="22"/>
                 <w:szCs w:val="22"/>
               </w:rPr>
@@ -4058,7 +3920,6 @@
                 <w:rFonts w:ascii="Arial" w:hAnsi="Arial" w:cs="Arial"/>
                 <w:bCs/>
                 <w:noProof/>
-                <w:color w:val="FF0000"/>
                 <w:sz w:val="22"/>
                 <w:szCs w:val="22"/>
               </w:rPr>
@@ -4109,17 +3970,15 @@
                 <w:rFonts w:ascii="Arial" w:hAnsi="Arial" w:cs="Arial"/>
                 <w:bCs/>
                 <w:noProof/>
-                <w:color w:val="FF0000"/>
-                <w:sz w:val="22"/>
-                <w:szCs w:val="22"/>
-              </w:rPr>
-            </w:pPr>
-            <w:r>
-              <w:rPr>
-                <w:rFonts w:ascii="Arial" w:hAnsi="Arial" w:cs="Arial"/>
-                <w:bCs/>
-                <w:noProof/>
-                <w:color w:val="FF0000"/>
+                <w:sz w:val="22"/>
+                <w:szCs w:val="22"/>
+              </w:rPr>
+            </w:pPr>
+            <w:r>
+              <w:rPr>
+                <w:rFonts w:ascii="Arial" w:hAnsi="Arial" w:cs="Arial"/>
+                <w:bCs/>
+                <w:noProof/>
                 <w:sz w:val="22"/>
                 <w:szCs w:val="22"/>
               </w:rPr>
@@ -4134,7 +3993,6 @@
                 <w:rFonts w:ascii="Arial" w:hAnsi="Arial" w:cs="Arial"/>
                 <w:bCs/>
                 <w:noProof/>
-                <w:color w:val="FF0000"/>
                 <w:sz w:val="22"/>
                 <w:szCs w:val="22"/>
               </w:rPr>
@@ -4148,7 +4006,6 @@
                 <w:rFonts w:ascii="Arial" w:hAnsi="Arial" w:cs="Arial"/>
                 <w:bCs/>
                 <w:noProof/>
-                <w:color w:val="FF0000"/>
                 <w:sz w:val="22"/>
                 <w:szCs w:val="22"/>
               </w:rPr>
@@ -4162,7 +4019,6 @@
                 <w:rFonts w:ascii="Arial" w:hAnsi="Arial" w:cs="Arial"/>
                 <w:bCs/>
                 <w:noProof/>
-                <w:color w:val="FF0000"/>
                 <w:sz w:val="22"/>
                 <w:szCs w:val="22"/>
               </w:rPr>
@@ -4176,7 +4032,6 @@
                 <w:rFonts w:ascii="Arial" w:hAnsi="Arial" w:cs="Arial"/>
                 <w:bCs/>
                 <w:noProof/>
-                <w:color w:val="FF0000"/>
                 <w:sz w:val="22"/>
                 <w:szCs w:val="22"/>
               </w:rPr>
@@ -4190,7 +4045,6 @@
                 <w:rFonts w:ascii="Arial" w:hAnsi="Arial" w:cs="Arial"/>
                 <w:bCs/>
                 <w:noProof/>
-                <w:color w:val="FF0000"/>
                 <w:sz w:val="22"/>
                 <w:szCs w:val="22"/>
               </w:rPr>
@@ -4204,7 +4058,6 @@
                 <w:rFonts w:ascii="Arial" w:hAnsi="Arial" w:cs="Arial"/>
                 <w:bCs/>
                 <w:noProof/>
-                <w:color w:val="FF0000"/>
                 <w:sz w:val="22"/>
                 <w:szCs w:val="22"/>
               </w:rPr>
@@ -4218,7 +4071,6 @@
                 <w:rFonts w:ascii="Arial" w:hAnsi="Arial" w:cs="Arial"/>
                 <w:bCs/>
                 <w:noProof/>
-                <w:color w:val="FF0000"/>
                 <w:sz w:val="22"/>
                 <w:szCs w:val="22"/>
               </w:rPr>
@@ -4232,7 +4084,6 @@
                 <w:rFonts w:ascii="Arial" w:hAnsi="Arial" w:cs="Arial"/>
                 <w:bCs/>
                 <w:noProof/>
-                <w:color w:val="FF0000"/>
                 <w:sz w:val="22"/>
                 <w:szCs w:val="22"/>
               </w:rPr>
@@ -4246,17 +4097,15 @@
                 <w:rFonts w:ascii="Arial" w:hAnsi="Arial" w:cs="Arial"/>
                 <w:bCs/>
                 <w:noProof/>
-                <w:color w:val="FF0000"/>
-                <w:sz w:val="22"/>
-                <w:szCs w:val="22"/>
-              </w:rPr>
-            </w:pPr>
-            <w:r>
-              <w:rPr>
-                <w:rFonts w:ascii="Arial" w:hAnsi="Arial" w:cs="Arial"/>
-                <w:bCs/>
-                <w:noProof/>
-                <w:color w:val="FF0000"/>
+                <w:sz w:val="22"/>
+                <w:szCs w:val="22"/>
+              </w:rPr>
+            </w:pPr>
+            <w:r>
+              <w:rPr>
+                <w:rFonts w:ascii="Arial" w:hAnsi="Arial" w:cs="Arial"/>
+                <w:bCs/>
+                <w:noProof/>
                 <w:sz w:val="22"/>
                 <w:szCs w:val="22"/>
               </w:rPr>
@@ -4280,7 +4129,6 @@
                 <w:rFonts w:ascii="Arial" w:hAnsi="Arial" w:cs="Arial"/>
                 <w:bCs/>
                 <w:noProof/>
-                <w:color w:val="FF0000"/>
                 <w:sz w:val="22"/>
                 <w:szCs w:val="22"/>
               </w:rPr>
@@ -4291,7 +4139,6 @@
                 <w:rFonts w:ascii="Arial" w:hAnsi="Arial" w:cs="Arial"/>
                 <w:bCs/>
                 <w:noProof/>
-                <w:color w:val="FF0000"/>
                 <w:sz w:val="22"/>
                 <w:szCs w:val="22"/>
               </w:rPr>
@@ -4524,7 +4371,6 @@
         </w:tabs>
         <w:rPr>
           <w:rFonts w:ascii="Arial" w:hAnsi="Arial" w:cs="Arial"/>
-          <w:color w:val="FF0000"/>
           <w:sz w:val="22"/>
           <w:szCs w:val="22"/>
         </w:rPr>
@@ -4542,7 +4388,6 @@
       <w:r>
         <w:rPr>
           <w:rFonts w:ascii="Arial" w:hAnsi="Arial" w:cs="Arial"/>
-          <w:color w:val="FF0000"/>
           <w:sz w:val="22"/>
           <w:szCs w:val="22"/>
         </w:rPr>
@@ -4552,7 +4397,6 @@
       <w:r>
         <w:rPr>
           <w:rFonts w:ascii="Arial" w:hAnsi="Arial" w:cs="Arial"/>
-          <w:color w:val="FF0000"/>
           <w:sz w:val="22"/>
           <w:szCs w:val="22"/>
         </w:rPr>
@@ -4562,7 +4406,6 @@
       <w:r>
         <w:rPr>
           <w:rFonts w:ascii="Arial" w:hAnsi="Arial" w:cs="Arial"/>
-          <w:color w:val="FF0000"/>
           <w:sz w:val="22"/>
           <w:szCs w:val="22"/>
         </w:rPr>
@@ -4572,7 +4415,6 @@
       <w:r>
         <w:rPr>
           <w:rFonts w:ascii="Arial" w:hAnsi="Arial" w:cs="Arial"/>
-          <w:color w:val="FF0000"/>
           <w:sz w:val="22"/>
           <w:szCs w:val="22"/>
         </w:rPr>
@@ -4581,7 +4423,6 @@
       <w:r>
         <w:rPr>
           <w:rFonts w:ascii="Arial" w:hAnsi="Arial" w:cs="Arial"/>
-          <w:color w:val="FF0000"/>
           <w:sz w:val="22"/>
           <w:szCs w:val="22"/>
         </w:rPr>
@@ -4591,7 +4432,6 @@
       <w:r>
         <w:rPr>
           <w:rFonts w:ascii="Arial" w:hAnsi="Arial" w:cs="Arial"/>
-          <w:color w:val="FF0000"/>
           <w:sz w:val="22"/>
           <w:szCs w:val="22"/>
         </w:rPr>
@@ -4601,7 +4441,6 @@
       <w:r>
         <w:rPr>
           <w:rFonts w:ascii="Arial" w:hAnsi="Arial" w:cs="Arial"/>
-          <w:color w:val="FF0000"/>
           <w:sz w:val="22"/>
           <w:szCs w:val="22"/>
         </w:rPr>
@@ -4610,7 +4449,6 @@
       <w:r>
         <w:rPr>
           <w:rFonts w:ascii="Arial" w:hAnsi="Arial" w:cs="Arial"/>
-          <w:color w:val="FF0000"/>
           <w:sz w:val="22"/>
           <w:szCs w:val="22"/>
         </w:rPr>
@@ -4620,7 +4458,6 @@
       <w:r>
         <w:rPr>
           <w:rFonts w:ascii="Arial" w:hAnsi="Arial" w:cs="Arial"/>
-          <w:color w:val="FF0000"/>
           <w:sz w:val="22"/>
           <w:szCs w:val="22"/>
         </w:rPr>
@@ -4635,16 +4472,16 @@
         <w:tblLook w:val="04A0" w:firstRow="1" w:lastRow="0" w:firstColumn="1" w:lastColumn="0" w:noHBand="0" w:noVBand="1"/>
       </w:tblPr>
       <w:tblGrid>
-        <w:gridCol w:w="572"/>
-        <w:gridCol w:w="1715"/>
-        <w:gridCol w:w="2151"/>
+        <w:gridCol w:w="573"/>
+        <w:gridCol w:w="1712"/>
+        <w:gridCol w:w="2138"/>
         <w:gridCol w:w="1623"/>
         <w:gridCol w:w="1684"/>
-        <w:gridCol w:w="1544"/>
-        <w:gridCol w:w="2025"/>
-        <w:gridCol w:w="2118"/>
+        <w:gridCol w:w="1537"/>
+        <w:gridCol w:w="2016"/>
+        <w:gridCol w:w="2117"/>
         <w:gridCol w:w="2125"/>
-        <w:gridCol w:w="1856"/>
+        <w:gridCol w:w="1888"/>
       </w:tblGrid>
       <w:tr>
         <w:trPr>
@@ -4736,17 +4573,7 @@
                 <w:sz w:val="22"/>
                 <w:szCs w:val="22"/>
               </w:rPr>
-              <w:t>NIP</w:t>
-            </w:r>
-            <w:r>
-              <w:rPr>
-                <w:rFonts w:ascii="Arial" w:hAnsi="Arial" w:cs="Arial"/>
-                <w:b/>
-                <w:bCs/>
-                <w:sz w:val="22"/>
-                <w:szCs w:val="22"/>
-              </w:rPr>
-              <w:t>/NIK</w:t>
+              <w:t>NIP/NIK</w:t>
             </w:r>
           </w:p>
         </w:tc>
@@ -4858,6 +4685,7 @@
                 <w:szCs w:val="22"/>
               </w:rPr>
             </w:pPr>
+            <w:proofErr w:type="spellStart"/>
             <w:r>
               <w:rPr>
                 <w:rFonts w:ascii="Arial" w:hAnsi="Arial" w:cs="Arial"/>
@@ -4866,8 +4694,31 @@
                 <w:sz w:val="22"/>
                 <w:szCs w:val="22"/>
               </w:rPr>
-              <w:t>Jumlah sampel</w:t>
-            </w:r>
+              <w:t>Jumlah</w:t>
+            </w:r>
+            <w:proofErr w:type="spellEnd"/>
+            <w:r>
+              <w:rPr>
+                <w:rFonts w:ascii="Arial" w:hAnsi="Arial" w:cs="Arial"/>
+                <w:b/>
+                <w:bCs/>
+                <w:sz w:val="22"/>
+                <w:szCs w:val="22"/>
+              </w:rPr>
+              <w:t xml:space="preserve"> </w:t>
+            </w:r>
+            <w:proofErr w:type="spellStart"/>
+            <w:r>
+              <w:rPr>
+                <w:rFonts w:ascii="Arial" w:hAnsi="Arial" w:cs="Arial"/>
+                <w:b/>
+                <w:bCs/>
+                <w:sz w:val="22"/>
+                <w:szCs w:val="22"/>
+              </w:rPr>
+              <w:t>sampel</w:t>
+            </w:r>
+            <w:proofErr w:type="spellEnd"/>
             <w:r>
               <w:rPr>
                 <w:rFonts w:ascii="Arial" w:hAnsi="Arial" w:cs="Arial"/>
@@ -5088,15 +4939,13 @@
               </w:tabs>
               <w:rPr>
                 <w:rFonts w:ascii="Arial" w:hAnsi="Arial" w:cs="Arial"/>
-                <w:color w:val="FF0000"/>
-                <w:sz w:val="22"/>
-                <w:szCs w:val="22"/>
-              </w:rPr>
-            </w:pPr>
-            <w:r>
-              <w:rPr>
-                <w:rFonts w:ascii="Arial" w:hAnsi="Arial" w:cs="Arial"/>
-                <w:color w:val="FF0000"/>
+                <w:sz w:val="22"/>
+                <w:szCs w:val="22"/>
+              </w:rPr>
+            </w:pPr>
+            <w:r>
+              <w:rPr>
+                <w:rFonts w:ascii="Arial" w:hAnsi="Arial" w:cs="Arial"/>
                 <w:sz w:val="22"/>
                 <w:szCs w:val="22"/>
               </w:rPr>
@@ -5115,15 +4964,13 @@
               </w:tabs>
               <w:rPr>
                 <w:rFonts w:ascii="Arial" w:hAnsi="Arial" w:cs="Arial"/>
-                <w:color w:val="FF0000"/>
-                <w:sz w:val="22"/>
-                <w:szCs w:val="22"/>
-              </w:rPr>
-            </w:pPr>
-            <w:r>
-              <w:rPr>
-                <w:rFonts w:ascii="Arial" w:hAnsi="Arial" w:cs="Arial"/>
-                <w:color w:val="FF0000"/>
+                <w:sz w:val="22"/>
+                <w:szCs w:val="22"/>
+              </w:rPr>
+            </w:pPr>
+            <w:r>
+              <w:rPr>
+                <w:rFonts w:ascii="Arial" w:hAnsi="Arial" w:cs="Arial"/>
                 <w:sz w:val="22"/>
                 <w:szCs w:val="22"/>
               </w:rPr>
@@ -5133,7 +4980,6 @@
             <w:r>
               <w:rPr>
                 <w:rFonts w:ascii="Arial" w:hAnsi="Arial" w:cs="Arial"/>
-                <w:color w:val="FF0000"/>
                 <w:sz w:val="22"/>
                 <w:szCs w:val="22"/>
               </w:rPr>
@@ -5143,7 +4989,6 @@
             <w:r>
               <w:rPr>
                 <w:rFonts w:ascii="Arial" w:hAnsi="Arial" w:cs="Arial"/>
-                <w:color w:val="FF0000"/>
                 <w:sz w:val="22"/>
                 <w:szCs w:val="22"/>
               </w:rPr>
@@ -5162,15 +5007,13 @@
               </w:tabs>
               <w:rPr>
                 <w:rFonts w:ascii="Arial" w:hAnsi="Arial" w:cs="Arial"/>
-                <w:color w:val="FF0000"/>
-                <w:sz w:val="22"/>
-                <w:szCs w:val="22"/>
-              </w:rPr>
-            </w:pPr>
-            <w:r>
-              <w:rPr>
-                <w:rFonts w:ascii="Arial" w:hAnsi="Arial" w:cs="Arial"/>
-                <w:color w:val="FF0000"/>
+                <w:sz w:val="22"/>
+                <w:szCs w:val="22"/>
+              </w:rPr>
+            </w:pPr>
+            <w:r>
+              <w:rPr>
+                <w:rFonts w:ascii="Arial" w:hAnsi="Arial" w:cs="Arial"/>
                 <w:sz w:val="22"/>
                 <w:szCs w:val="22"/>
               </w:rPr>
@@ -5180,7 +5023,6 @@
             <w:r>
               <w:rPr>
                 <w:rFonts w:ascii="Arial" w:hAnsi="Arial" w:cs="Arial"/>
-                <w:color w:val="FF0000"/>
                 <w:sz w:val="22"/>
                 <w:szCs w:val="22"/>
               </w:rPr>
@@ -5190,7 +5032,6 @@
             <w:r>
               <w:rPr>
                 <w:rFonts w:ascii="Arial" w:hAnsi="Arial" w:cs="Arial"/>
-                <w:color w:val="FF0000"/>
                 <w:sz w:val="22"/>
                 <w:szCs w:val="22"/>
               </w:rPr>
@@ -5209,15 +5050,13 @@
               </w:tabs>
               <w:rPr>
                 <w:rFonts w:ascii="Arial" w:hAnsi="Arial" w:cs="Arial"/>
-                <w:color w:val="FF0000"/>
-                <w:sz w:val="22"/>
-                <w:szCs w:val="22"/>
-              </w:rPr>
-            </w:pPr>
-            <w:r>
-              <w:rPr>
-                <w:rFonts w:ascii="Arial" w:hAnsi="Arial" w:cs="Arial"/>
-                <w:color w:val="FF0000"/>
+                <w:sz w:val="22"/>
+                <w:szCs w:val="22"/>
+              </w:rPr>
+            </w:pPr>
+            <w:r>
+              <w:rPr>
+                <w:rFonts w:ascii="Arial" w:hAnsi="Arial" w:cs="Arial"/>
                 <w:sz w:val="22"/>
                 <w:szCs w:val="22"/>
               </w:rPr>
@@ -5227,7 +5066,6 @@
             <w:r>
               <w:rPr>
                 <w:rFonts w:ascii="Arial" w:hAnsi="Arial" w:cs="Arial"/>
-                <w:color w:val="FF0000"/>
                 <w:sz w:val="22"/>
                 <w:szCs w:val="22"/>
               </w:rPr>
@@ -5237,7 +5075,6 @@
             <w:r>
               <w:rPr>
                 <w:rFonts w:ascii="Arial" w:hAnsi="Arial" w:cs="Arial"/>
-                <w:color w:val="FF0000"/>
                 <w:sz w:val="22"/>
                 <w:szCs w:val="22"/>
               </w:rPr>
@@ -5256,15 +5093,13 @@
               </w:tabs>
               <w:rPr>
                 <w:rFonts w:ascii="Arial" w:hAnsi="Arial" w:cs="Arial"/>
-                <w:color w:val="FF0000"/>
-                <w:sz w:val="22"/>
-                <w:szCs w:val="22"/>
-              </w:rPr>
-            </w:pPr>
-            <w:r>
-              <w:rPr>
-                <w:rFonts w:ascii="Arial" w:hAnsi="Arial" w:cs="Arial"/>
-                <w:color w:val="FF0000"/>
+                <w:sz w:val="22"/>
+                <w:szCs w:val="22"/>
+              </w:rPr>
+            </w:pPr>
+            <w:r>
+              <w:rPr>
+                <w:rFonts w:ascii="Arial" w:hAnsi="Arial" w:cs="Arial"/>
                 <w:sz w:val="22"/>
                 <w:szCs w:val="22"/>
               </w:rPr>
@@ -5274,7 +5109,6 @@
             <w:r>
               <w:rPr>
                 <w:rFonts w:ascii="Arial" w:hAnsi="Arial" w:cs="Arial"/>
-                <w:color w:val="FF0000"/>
                 <w:sz w:val="22"/>
                 <w:szCs w:val="22"/>
               </w:rPr>
@@ -5284,7 +5118,6 @@
             <w:r>
               <w:rPr>
                 <w:rFonts w:ascii="Arial" w:hAnsi="Arial" w:cs="Arial"/>
-                <w:color w:val="FF0000"/>
                 <w:sz w:val="22"/>
                 <w:szCs w:val="22"/>
               </w:rPr>
@@ -5303,15 +5136,13 @@
               </w:tabs>
               <w:rPr>
                 <w:rFonts w:ascii="Arial" w:hAnsi="Arial" w:cs="Arial"/>
-                <w:color w:val="FF0000"/>
-                <w:sz w:val="22"/>
-                <w:szCs w:val="22"/>
-              </w:rPr>
-            </w:pPr>
-            <w:r>
-              <w:rPr>
-                <w:rFonts w:ascii="Arial" w:hAnsi="Arial" w:cs="Arial"/>
-                <w:color w:val="FF0000"/>
+                <w:sz w:val="22"/>
+                <w:szCs w:val="22"/>
+              </w:rPr>
+            </w:pPr>
+            <w:r>
+              <w:rPr>
+                <w:rFonts w:ascii="Arial" w:hAnsi="Arial" w:cs="Arial"/>
                 <w:sz w:val="22"/>
                 <w:szCs w:val="22"/>
               </w:rPr>
@@ -5321,7 +5152,6 @@
             <w:r>
               <w:rPr>
                 <w:rFonts w:ascii="Arial" w:hAnsi="Arial" w:cs="Arial"/>
-                <w:color w:val="FF0000"/>
                 <w:sz w:val="22"/>
                 <w:szCs w:val="22"/>
               </w:rPr>
@@ -5331,7 +5161,6 @@
             <w:r>
               <w:rPr>
                 <w:rFonts w:ascii="Arial" w:hAnsi="Arial" w:cs="Arial"/>
-                <w:color w:val="FF0000"/>
                 <w:sz w:val="22"/>
                 <w:szCs w:val="22"/>
               </w:rPr>
@@ -5350,15 +5179,13 @@
               </w:tabs>
               <w:rPr>
                 <w:rFonts w:ascii="Arial" w:hAnsi="Arial" w:cs="Arial"/>
-                <w:color w:val="FF0000"/>
-                <w:sz w:val="22"/>
-                <w:szCs w:val="22"/>
-              </w:rPr>
-            </w:pPr>
-            <w:r>
-              <w:rPr>
-                <w:rFonts w:ascii="Arial" w:hAnsi="Arial" w:cs="Arial"/>
-                <w:color w:val="FF0000"/>
+                <w:sz w:val="22"/>
+                <w:szCs w:val="22"/>
+              </w:rPr>
+            </w:pPr>
+            <w:r>
+              <w:rPr>
+                <w:rFonts w:ascii="Arial" w:hAnsi="Arial" w:cs="Arial"/>
                 <w:sz w:val="22"/>
                 <w:szCs w:val="22"/>
               </w:rPr>
@@ -5368,7 +5195,6 @@
             <w:r>
               <w:rPr>
                 <w:rFonts w:ascii="Arial" w:hAnsi="Arial" w:cs="Arial"/>
-                <w:color w:val="FF0000"/>
                 <w:sz w:val="22"/>
                 <w:szCs w:val="22"/>
               </w:rPr>
@@ -5378,7 +5204,6 @@
             <w:r>
               <w:rPr>
                 <w:rFonts w:ascii="Arial" w:hAnsi="Arial" w:cs="Arial"/>
-                <w:color w:val="FF0000"/>
                 <w:sz w:val="22"/>
                 <w:szCs w:val="22"/>
               </w:rPr>
@@ -5387,7 +5212,6 @@
             <w:r>
               <w:rPr>
                 <w:rFonts w:ascii="Arial" w:hAnsi="Arial" w:cs="Arial"/>
-                <w:color w:val="FF0000"/>
                 <w:sz w:val="22"/>
                 <w:szCs w:val="22"/>
               </w:rPr>
@@ -5406,15 +5230,13 @@
               </w:tabs>
               <w:rPr>
                 <w:rFonts w:ascii="Arial" w:hAnsi="Arial" w:cs="Arial"/>
-                <w:color w:val="FF0000"/>
-                <w:sz w:val="22"/>
-                <w:szCs w:val="22"/>
-              </w:rPr>
-            </w:pPr>
-            <w:r>
-              <w:rPr>
-                <w:rFonts w:ascii="Arial" w:hAnsi="Arial" w:cs="Arial"/>
-                <w:color w:val="FF0000"/>
+                <w:sz w:val="22"/>
+                <w:szCs w:val="22"/>
+              </w:rPr>
+            </w:pPr>
+            <w:r>
+              <w:rPr>
+                <w:rFonts w:ascii="Arial" w:hAnsi="Arial" w:cs="Arial"/>
                 <w:sz w:val="22"/>
                 <w:szCs w:val="22"/>
               </w:rPr>
@@ -5424,7 +5246,6 @@
             <w:r>
               <w:rPr>
                 <w:rFonts w:ascii="Arial" w:hAnsi="Arial" w:cs="Arial"/>
-                <w:color w:val="FF0000"/>
                 <w:sz w:val="22"/>
                 <w:szCs w:val="22"/>
               </w:rPr>
@@ -5434,7 +5255,6 @@
             <w:r>
               <w:rPr>
                 <w:rFonts w:ascii="Arial" w:hAnsi="Arial" w:cs="Arial"/>
-                <w:color w:val="FF0000"/>
                 <w:sz w:val="22"/>
                 <w:szCs w:val="22"/>
               </w:rPr>
@@ -5443,7 +5263,6 @@
             <w:r>
               <w:rPr>
                 <w:rFonts w:ascii="Arial" w:hAnsi="Arial" w:cs="Arial"/>
-                <w:color w:val="FF0000"/>
                 <w:sz w:val="22"/>
                 <w:szCs w:val="22"/>
               </w:rPr>
@@ -5462,15 +5281,13 @@
               </w:tabs>
               <w:rPr>
                 <w:rFonts w:ascii="Arial" w:hAnsi="Arial" w:cs="Arial"/>
-                <w:color w:val="FF0000"/>
-                <w:sz w:val="22"/>
-                <w:szCs w:val="22"/>
-              </w:rPr>
-            </w:pPr>
-            <w:r>
-              <w:rPr>
-                <w:rFonts w:ascii="Arial" w:hAnsi="Arial" w:cs="Arial"/>
-                <w:color w:val="FF0000"/>
+                <w:sz w:val="22"/>
+                <w:szCs w:val="22"/>
+              </w:rPr>
+            </w:pPr>
+            <w:r>
+              <w:rPr>
+                <w:rFonts w:ascii="Arial" w:hAnsi="Arial" w:cs="Arial"/>
                 <w:sz w:val="22"/>
                 <w:szCs w:val="22"/>
               </w:rPr>
@@ -5480,7 +5297,6 @@
             <w:r>
               <w:rPr>
                 <w:rFonts w:ascii="Arial" w:hAnsi="Arial" w:cs="Arial"/>
-                <w:color w:val="FF0000"/>
                 <w:sz w:val="22"/>
                 <w:szCs w:val="22"/>
               </w:rPr>
@@ -5490,7 +5306,6 @@
             <w:r>
               <w:rPr>
                 <w:rFonts w:ascii="Arial" w:hAnsi="Arial" w:cs="Arial"/>
-                <w:color w:val="FF0000"/>
                 <w:sz w:val="22"/>
                 <w:szCs w:val="22"/>
               </w:rPr>
@@ -5499,7 +5314,6 @@
             <w:r>
               <w:rPr>
                 <w:rFonts w:ascii="Arial" w:hAnsi="Arial" w:cs="Arial"/>
-                <w:color w:val="FF0000"/>
                 <w:sz w:val="22"/>
                 <w:szCs w:val="22"/>
               </w:rPr>
@@ -5509,7 +5323,6 @@
             <w:r>
               <w:rPr>
                 <w:rFonts w:ascii="Arial" w:hAnsi="Arial" w:cs="Arial"/>
-                <w:color w:val="FF0000"/>
                 <w:sz w:val="22"/>
                 <w:szCs w:val="22"/>
               </w:rPr>
@@ -5519,7 +5332,6 @@
             <w:r>
               <w:rPr>
                 <w:rFonts w:ascii="Arial" w:hAnsi="Arial" w:cs="Arial"/>
-                <w:color w:val="FF0000"/>
                 <w:sz w:val="22"/>
                 <w:szCs w:val="22"/>
               </w:rPr>
@@ -5528,7 +5340,6 @@
             <w:r>
               <w:rPr>
                 <w:rFonts w:ascii="Arial" w:hAnsi="Arial" w:cs="Arial"/>
-                <w:color w:val="FF0000"/>
                 <w:sz w:val="22"/>
                 <w:szCs w:val="22"/>
               </w:rPr>
@@ -5538,7 +5349,6 @@
             <w:r>
               <w:rPr>
                 <w:rFonts w:ascii="Arial" w:hAnsi="Arial" w:cs="Arial"/>
-                <w:color w:val="FF0000"/>
                 <w:sz w:val="22"/>
                 <w:szCs w:val="22"/>
               </w:rPr>
@@ -5548,7 +5358,6 @@
             <w:r>
               <w:rPr>
                 <w:rFonts w:ascii="Arial" w:hAnsi="Arial" w:cs="Arial"/>
-                <w:color w:val="FF0000"/>
                 <w:sz w:val="22"/>
                 <w:szCs w:val="22"/>
               </w:rPr>
@@ -5567,31 +5376,44 @@
               </w:tabs>
               <w:rPr>
                 <w:rFonts w:ascii="Arial" w:hAnsi="Arial" w:cs="Arial"/>
-                <w:color w:val="FF0000"/>
-                <w:sz w:val="22"/>
-                <w:szCs w:val="22"/>
-              </w:rPr>
-            </w:pPr>
-            <w:r>
-              <w:rPr>
-                <w:rFonts w:ascii="Arial" w:hAnsi="Arial" w:cs="Arial"/>
-                <w:color w:val="FF0000"/>
+                <w:sz w:val="22"/>
+                <w:szCs w:val="22"/>
+              </w:rPr>
+            </w:pPr>
+            <w:r>
+              <w:rPr>
+                <w:rFonts w:ascii="Arial" w:hAnsi="Arial" w:cs="Arial"/>
                 <w:sz w:val="22"/>
                 <w:szCs w:val="22"/>
               </w:rPr>
               <w:t>$</w:t>
             </w:r>
+            <w:r>
+              <w:rPr>
+                <w:rFonts w:ascii="Arial" w:hAnsi="Arial" w:cs="Arial"/>
+                <w:sz w:val="22"/>
+                <w:szCs w:val="22"/>
+              </w:rPr>
+              <w:t>{</w:t>
+            </w:r>
             <w:proofErr w:type="spellStart"/>
             <w:r>
               <w:rPr>
                 <w:rFonts w:ascii="Arial" w:hAnsi="Arial" w:cs="Arial"/>
-                <w:color w:val="FF0000"/>
                 <w:sz w:val="22"/>
                 <w:szCs w:val="22"/>
               </w:rPr>
               <w:t>lamp_honor</w:t>
             </w:r>
             <w:proofErr w:type="spellEnd"/>
+            <w:r>
+              <w:rPr>
+                <w:rFonts w:ascii="Arial" w:hAnsi="Arial" w:cs="Arial"/>
+                <w:sz w:val="22"/>
+                <w:szCs w:val="22"/>
+              </w:rPr>
+              <w:t>}</w:t>
+            </w:r>
           </w:p>
         </w:tc>
       </w:tr>
@@ -5904,32 +5726,19 @@
                 <w:rFonts w:ascii="Arial" w:hAnsi="Arial" w:cs="Arial"/>
                 <w:bCs/>
                 <w:noProof/>
-                <w:color w:val="FF0000"/>
-                <w:sz w:val="22"/>
-                <w:szCs w:val="22"/>
-              </w:rPr>
-            </w:pPr>
-            <w:r>
-              <w:rPr>
-                <w:rFonts w:ascii="Arial" w:hAnsi="Arial" w:cs="Arial"/>
-                <w:bCs/>
-                <w:noProof/>
-                <w:color w:val="FF0000"/>
-                <w:sz w:val="22"/>
-                <w:szCs w:val="22"/>
-              </w:rPr>
-              <w:t xml:space="preserve">Sinabang, </w:t>
-            </w:r>
-            <w:r>
-              <w:rPr>
-                <w:rFonts w:ascii="Arial" w:hAnsi="Arial" w:cs="Arial"/>
-                <w:bCs/>
-                <w:noProof/>
-                <w:color w:val="FF0000"/>
-                <w:sz w:val="22"/>
-                <w:szCs w:val="22"/>
-              </w:rPr>
-              <w:t>${tgl_kak}</w:t>
+                <w:sz w:val="22"/>
+                <w:szCs w:val="22"/>
+              </w:rPr>
+            </w:pPr>
+            <w:r>
+              <w:rPr>
+                <w:rFonts w:ascii="Arial" w:hAnsi="Arial" w:cs="Arial"/>
+                <w:bCs/>
+                <w:noProof/>
+                <w:sz w:val="22"/>
+                <w:szCs w:val="22"/>
+              </w:rPr>
+              <w:t>Sinabang, ${tgl_kak}</w:t>
             </w:r>
           </w:p>
           <w:p>
@@ -5976,17 +5785,15 @@
                 <w:rFonts w:ascii="Arial" w:hAnsi="Arial" w:cs="Arial"/>
                 <w:bCs/>
                 <w:noProof/>
-                <w:color w:val="FF0000"/>
-                <w:sz w:val="22"/>
-                <w:szCs w:val="22"/>
-              </w:rPr>
-            </w:pPr>
-            <w:r>
-              <w:rPr>
-                <w:rFonts w:ascii="Arial" w:hAnsi="Arial" w:cs="Arial"/>
-                <w:bCs/>
-                <w:noProof/>
-                <w:color w:val="FF0000"/>
+                <w:sz w:val="22"/>
+                <w:szCs w:val="22"/>
+              </w:rPr>
+            </w:pPr>
+            <w:r>
+              <w:rPr>
+                <w:rFonts w:ascii="Arial" w:hAnsi="Arial" w:cs="Arial"/>
+                <w:bCs/>
+                <w:noProof/>
                 <w:sz w:val="22"/>
                 <w:szCs w:val="22"/>
               </w:rPr>
@@ -6001,7 +5808,6 @@
                 <w:rFonts w:ascii="Arial" w:hAnsi="Arial" w:cs="Arial"/>
                 <w:bCs/>
                 <w:noProof/>
-                <w:color w:val="FF0000"/>
                 <w:sz w:val="22"/>
                 <w:szCs w:val="22"/>
               </w:rPr>
@@ -6015,7 +5821,6 @@
                 <w:rFonts w:ascii="Arial" w:hAnsi="Arial" w:cs="Arial"/>
                 <w:bCs/>
                 <w:noProof/>
-                <w:color w:val="FF0000"/>
                 <w:sz w:val="22"/>
                 <w:szCs w:val="22"/>
               </w:rPr>
@@ -6029,7 +5834,6 @@
                 <w:rFonts w:ascii="Arial" w:hAnsi="Arial" w:cs="Arial"/>
                 <w:bCs/>
                 <w:noProof/>
-                <w:color w:val="FF0000"/>
                 <w:sz w:val="22"/>
                 <w:szCs w:val="22"/>
               </w:rPr>
@@ -6043,7 +5847,6 @@
                 <w:rFonts w:ascii="Arial" w:hAnsi="Arial" w:cs="Arial"/>
                 <w:bCs/>
                 <w:noProof/>
-                <w:color w:val="FF0000"/>
                 <w:sz w:val="22"/>
                 <w:szCs w:val="22"/>
               </w:rPr>
@@ -6057,7 +5860,6 @@
                 <w:rFonts w:ascii="Arial" w:hAnsi="Arial" w:cs="Arial"/>
                 <w:bCs/>
                 <w:noProof/>
-                <w:color w:val="FF0000"/>
                 <w:sz w:val="22"/>
                 <w:szCs w:val="22"/>
               </w:rPr>
@@ -6071,7 +5873,6 @@
                 <w:rFonts w:ascii="Arial" w:hAnsi="Arial" w:cs="Arial"/>
                 <w:bCs/>
                 <w:noProof/>
-                <w:color w:val="FF0000"/>
                 <w:sz w:val="22"/>
                 <w:szCs w:val="22"/>
               </w:rPr>
@@ -6085,7 +5886,6 @@
                 <w:rFonts w:ascii="Arial" w:hAnsi="Arial" w:cs="Arial"/>
                 <w:bCs/>
                 <w:noProof/>
-                <w:color w:val="FF0000"/>
                 <w:sz w:val="22"/>
                 <w:szCs w:val="22"/>
               </w:rPr>
@@ -6099,7 +5899,6 @@
                 <w:rFonts w:ascii="Arial" w:hAnsi="Arial" w:cs="Arial"/>
                 <w:bCs/>
                 <w:noProof/>
-                <w:color w:val="FF0000"/>
                 <w:sz w:val="22"/>
                 <w:szCs w:val="22"/>
               </w:rPr>
@@ -6113,17 +5912,15 @@
                 <w:rFonts w:ascii="Arial" w:hAnsi="Arial" w:cs="Arial"/>
                 <w:bCs/>
                 <w:noProof/>
-                <w:color w:val="FF0000"/>
-                <w:sz w:val="22"/>
-                <w:szCs w:val="22"/>
-              </w:rPr>
-            </w:pPr>
-            <w:r>
-              <w:rPr>
-                <w:rFonts w:ascii="Arial" w:hAnsi="Arial" w:cs="Arial"/>
-                <w:bCs/>
-                <w:noProof/>
-                <w:color w:val="FF0000"/>
+                <w:sz w:val="22"/>
+                <w:szCs w:val="22"/>
+              </w:rPr>
+            </w:pPr>
+            <w:r>
+              <w:rPr>
+                <w:rFonts w:ascii="Arial" w:hAnsi="Arial" w:cs="Arial"/>
+                <w:bCs/>
+                <w:noProof/>
                 <w:sz w:val="22"/>
                 <w:szCs w:val="22"/>
               </w:rPr>
@@ -6147,22 +5944,10 @@
                 <w:rFonts w:ascii="Arial" w:hAnsi="Arial" w:cs="Arial"/>
                 <w:bCs/>
                 <w:noProof/>
-                <w:color w:val="FF0000"/>
-                <w:sz w:val="22"/>
-                <w:szCs w:val="22"/>
-              </w:rPr>
-              <w:t>NIP.</w:t>
-            </w:r>
-            <w:r>
-              <w:rPr>
-                <w:rFonts w:ascii="Arial" w:hAnsi="Arial" w:cs="Arial"/>
-                <w:bCs/>
-                <w:noProof/>
-                <w:color w:val="FF0000"/>
-                <w:sz w:val="22"/>
-                <w:szCs w:val="22"/>
-              </w:rPr>
-              <w:t>${nip_pengaju}</w:t>
+                <w:sz w:val="22"/>
+                <w:szCs w:val="22"/>
+              </w:rPr>
+              <w:t>NIP.${nip_pengaju}</w:t>
             </w:r>
           </w:p>
         </w:tc>

</xml_diff>